<commit_message>
Actualización de documentos + Arreglo de título
</commit_message>
<xml_diff>
--- a/FASE 2/EVIDENCIAS PROYECTO/EVIDENCIAS DE DOCUMENTACION/1- Inicio del proyecto/1- Acta de Constitución CultureGo.docx
+++ b/FASE 2/EVIDENCIAS PROYECTO/EVIDENCIAS DE DOCUMENTACION/1- Inicio del proyecto/1- Acta de Constitución CultureGo.docx
@@ -1757,7 +1757,7 @@
                 <w:szCs w:val="22"/>
                 <w:rtl w:val="0"/>
               </w:rPr>
-              <w:t xml:space="preserve">Pruebas de usabilidad con al menos 10 usuarios reales, con tasa de finalización de tareas &gt;= 80%</w:t>
+              <w:t xml:space="preserve">Pruebas de usabilidad con al menos 3 usuarios reales que usan libremente la app, con una valoración promedio de al menos 4 de 5 estrellas</w:t>
             </w:r>
           </w:p>
         </w:tc>
@@ -1831,7 +1831,7 @@
                 <w:szCs w:val="22"/>
                 <w:rtl w:val="0"/>
               </w:rPr>
-              <w:t xml:space="preserve">Catálogo carga en &lt;3 segundos y el mapa responde en &lt;2 segundos, según RNF-03 y RNF-04.</w:t>
+              <w:t xml:space="preserve">Catálogo carga en &lt;3 segundos y el mapa responde en un máximo de 3 segundos, según RNF-03 y RNF-04.</w:t>
             </w:r>
           </w:p>
         </w:tc>

</xml_diff>